<commit_message>
Date de dernière mise à jour des documents : 25 septembre 2026
- En-tête des documents Word et PDF : ajout de « Mise à jour :
  25 septembre 2026 » / « Updated: September 25, 2026 »
- Pages HTML des documents : même mention (FR + EN)
- Section Documents de l'accueil : ligne « Dernière mise à jour »
- Word/PDF régénérés + ZIP reconstruit

Co-Authored-By: Claude Opus 4.8 <noreply@anthropic.com>
</commit_message>
<xml_diff>
--- a/telechargements/word-en/1-Statuts-reglements-Bylaws.docx
+++ b/telechargements/word-en/1-Statuts-reglements-Bylaws.docx
@@ -83,6 +83,20 @@
           <w:color w:val="5B6675"/>
         </w:rPr>
         <w:t xml:space="preserve">June 2, 2026</w:t>
+      </w:r>
+      <w:r>
+        <w:rPr>
+          <w:b/>
+          <w:bCs/>
+          <w:color w:val="15263F"/>
+        </w:rPr>
+        <w:t xml:space="preserve">    Updated : </w:t>
+      </w:r>
+      <w:r>
+        <w:rPr>
+          <w:color w:val="5B6675"/>
+        </w:rPr>
+        <w:t xml:space="preserve">September 25, 2026</w:t>
       </w:r>
     </w:p>
     <w:p>

</xml_diff>